<commit_message>
Holy Spirit: use John 1:33 for Jesus as baptizer with the Spirit
Co-Authored-By: Claude Opus 5.5 <noreply@anthropic.com>
Claude-Session: https://claude.ai/code/session_01XHuwaGFtGKmvrnEvdFo2Ju
</commit_message>
<xml_diff>
--- a/holy_spirit/Holy Spirit - draft.docx
+++ b/holy_spirit/Holy Spirit - draft.docx
@@ -1547,7 +1547,7 @@
           <w:b w:val="0"/>
           <w:i w:val="0"/>
         </w:rPr>
-        <w:t>Jesus was the administrator of Holy Spirit baptism (John 1:3).</w:t>
+        <w:t>Jesus was the administrator of Holy Spirit baptism (John 1:33).</w:t>
       </w:r>
     </w:p>
     <w:p>
@@ -1572,7 +1572,7 @@
           <w:i w:val="0"/>
           <w:sz w:val="24"/>
         </w:rPr>
-        <w:t xml:space="preserve"> (John 1:3)</w:t>
+        <w:t xml:space="preserve"> (John 1:33)</w:t>
       </w:r>
     </w:p>
     <w:p>

</xml_diff>